<commit_message>
Add new report template formats and templates
</commit_message>
<xml_diff>
--- a/templates/NIA Low Cost.docx
+++ b/templates/NIA Low Cost.docx
@@ -85,10 +85,30 @@
           <w:sz w:val="24"/>
           <w:u w:val="single"/>
         </w:rPr>
-        <w:t>MEDI ASSIST INDIA TPA PVT LTD.</w:t>
+        <w:t xml:space="preserve">Volo Health Insurance </w:t>
+      </w:r>
+      <w:r>
+        <w:rPr>
+          <w:rFonts w:ascii="Calibri" w:eastAsia="Calibri" w:hAnsi="Calibri"/>
+          <w:b/>
+          <w:color w:val="000000"/>
+          <w:sz w:val="24"/>
+          <w:u w:val="single"/>
+        </w:rPr>
+        <w:t>TPA PVT LTD.</w:t>
       </w:r>
     </w:p>
     <w:p>
+      <w:r>
+        <w:rPr>
+          <w:rFonts w:ascii="Calibri" w:eastAsia="Calibri" w:hAnsi="Calibri"/>
+          <w:b/>
+          <w:color w:val="000000"/>
+          <w:sz w:val="24"/>
+          <w:u w:val="single"/>
+        </w:rPr>
+        <w:t xml:space="preserve">STANDARD </w:t>
+      </w:r>
       <w:r>
         <w:rPr>
           <w:rFonts w:ascii="Calibri" w:eastAsia="Calibri" w:hAnsi="Calibri"/>
@@ -101,24 +121,34 @@
       </w:r>
     </w:p>
     <w:p>
-      <w:pPr>
-        <w:pStyle w:val="Header"/>
-        <w:rPr>
-          <w:u w:val="single"/>
-        </w:rPr>
-      </w:pPr>
       <w:r>
         <w:rPr>
-          <w:rFonts w:ascii="Calibri" w:eastAsia="Calibri" w:hAnsi="Calibri"/>
+          <w:rFonts w:ascii="Arial" w:eastAsia="Arial" w:hAnsi="Arial"/>
           <w:b/>
           <w:color w:val="000000"/>
           <w:sz w:val="24"/>
-          <w:u w:val="single"/>
         </w:rPr>
-        <w:t>(NEW INDIA ASSURANCE LTD)</w:t>
+        <w:t>(</w:t>
+      </w:r>
+      <w:r>
+        <w:rPr>
+          <w:rFonts w:ascii="Arial" w:eastAsia="Arial" w:hAnsi="Arial"/>
+          <w:b/>
+          <w:color w:val="000000"/>
+          <w:sz w:val="24"/>
+        </w:rPr>
+        <w:t>{insurancecompany}</w:t>
+      </w:r>
+      <w:r>
+        <w:rPr>
+          <w:rFonts w:ascii="Arial" w:eastAsia="Arial" w:hAnsi="Arial"/>
+          <w:b/>
+          <w:color w:val="000000"/>
+          <w:sz w:val="24"/>
+        </w:rPr>
+        <w:t>)</w:t>
       </w:r>
     </w:p>
-    <w:p/>
     <w:tbl>
       <w:tblPr>
         <w:tblW w:w="5000" w:type="pct"/>
@@ -388,25 +418,7 @@
                 <w:sz w:val="24"/>
                 <w:szCs w:val="24"/>
               </w:rPr>
-              <w:t>{</w:t>
-            </w:r>
-            <w:proofErr w:type="spellStart"/>
-            <w:r>
-              <w:rPr>
-                <w:rFonts w:asciiTheme="minorHAnsi" w:hAnsiTheme="minorHAnsi" w:cstheme="minorHAnsi"/>
-                <w:sz w:val="24"/>
-                <w:szCs w:val="24"/>
-              </w:rPr>
-              <w:t>patientname</w:t>
-            </w:r>
-            <w:proofErr w:type="spellEnd"/>
-            <w:r>
-              <w:rPr>
-                <w:rFonts w:asciiTheme="minorHAnsi" w:hAnsiTheme="minorHAnsi" w:cstheme="minorHAnsi"/>
-                <w:sz w:val="24"/>
-                <w:szCs w:val="24"/>
-              </w:rPr>
-              <w:t>}</w:t>
+              <w:t>{patientname}</w:t>
             </w:r>
           </w:p>
         </w:tc>
@@ -441,25 +453,7 @@
                 <w:sz w:val="24"/>
                 <w:szCs w:val="24"/>
               </w:rPr>
-              <w:t>{</w:t>
-            </w:r>
-            <w:proofErr w:type="spellStart"/>
-            <w:r>
-              <w:rPr>
-                <w:rFonts w:asciiTheme="minorHAnsi" w:hAnsiTheme="minorHAnsi" w:cstheme="minorHAnsi"/>
-                <w:sz w:val="24"/>
-                <w:szCs w:val="24"/>
-              </w:rPr>
-              <w:t>patientname</w:t>
-            </w:r>
-            <w:proofErr w:type="spellEnd"/>
-            <w:r>
-              <w:rPr>
-                <w:rFonts w:asciiTheme="minorHAnsi" w:hAnsiTheme="minorHAnsi" w:cstheme="minorHAnsi"/>
-                <w:sz w:val="24"/>
-                <w:szCs w:val="24"/>
-              </w:rPr>
-              <w:t>}</w:t>
+              <w:t>{patientname}</w:t>
             </w:r>
           </w:p>
         </w:tc>
@@ -1078,31 +1072,7 @@
                 <w:szCs w:val="24"/>
                 <w:lang w:val="en-US"/>
               </w:rPr>
-              <w:t>{</w:t>
-            </w:r>
-            <w:proofErr w:type="spellStart"/>
-            <w:r>
-              <w:rPr>
-                <w:rFonts w:asciiTheme="minorHAnsi" w:hAnsiTheme="minorHAnsi" w:cstheme="minorHAnsi"/>
-                <w:b w:val="0"/>
-                <w:bCs w:val="0"/>
-                <w:sz w:val="24"/>
-                <w:szCs w:val="24"/>
-                <w:lang w:val="en-US"/>
-              </w:rPr>
-              <w:t>policyno</w:t>
-            </w:r>
-            <w:proofErr w:type="spellEnd"/>
-            <w:r>
-              <w:rPr>
-                <w:rFonts w:asciiTheme="minorHAnsi" w:hAnsiTheme="minorHAnsi" w:cstheme="minorHAnsi"/>
-                <w:b w:val="0"/>
-                <w:bCs w:val="0"/>
-                <w:sz w:val="24"/>
-                <w:szCs w:val="24"/>
-                <w:lang w:val="en-US"/>
-              </w:rPr>
-              <w:t>}</w:t>
+              <w:t>{policyno}</w:t>
             </w:r>
           </w:p>
         </w:tc>
@@ -1172,27 +1142,7 @@
                 <w:sz w:val="24"/>
                 <w:szCs w:val="24"/>
               </w:rPr>
-              <w:t>{</w:t>
-            </w:r>
-            <w:proofErr w:type="spellStart"/>
-            <w:r>
-              <w:rPr>
-                <w:rFonts w:asciiTheme="minorHAnsi" w:hAnsiTheme="minorHAnsi" w:cstheme="minorHAnsi"/>
-                <w:bCs/>
-                <w:sz w:val="24"/>
-                <w:szCs w:val="24"/>
-              </w:rPr>
-              <w:t>claimno</w:t>
-            </w:r>
-            <w:proofErr w:type="spellEnd"/>
-            <w:r>
-              <w:rPr>
-                <w:rFonts w:asciiTheme="minorHAnsi" w:hAnsiTheme="minorHAnsi" w:cstheme="minorHAnsi"/>
-                <w:bCs/>
-                <w:sz w:val="24"/>
-                <w:szCs w:val="24"/>
-              </w:rPr>
-              <w:t>}</w:t>
+              <w:t>{claimno}</w:t>
             </w:r>
           </w:p>
         </w:tc>
@@ -1440,25 +1390,7 @@
                 <w:sz w:val="24"/>
                 <w:szCs w:val="24"/>
               </w:rPr>
-              <w:t>{</w:t>
-            </w:r>
-            <w:proofErr w:type="spellStart"/>
-            <w:r>
-              <w:rPr>
-                <w:rFonts w:asciiTheme="minorHAnsi" w:hAnsiTheme="minorHAnsi" w:cstheme="minorHAnsi"/>
-                <w:sz w:val="24"/>
-                <w:szCs w:val="24"/>
-              </w:rPr>
-              <w:t>doa</w:t>
-            </w:r>
-            <w:proofErr w:type="spellEnd"/>
-            <w:r>
-              <w:rPr>
-                <w:rFonts w:asciiTheme="minorHAnsi" w:hAnsiTheme="minorHAnsi" w:cstheme="minorHAnsi"/>
-                <w:sz w:val="24"/>
-                <w:szCs w:val="24"/>
-              </w:rPr>
-              <w:t>}</w:t>
+              <w:t>{doa}</w:t>
             </w:r>
           </w:p>
         </w:tc>
@@ -1526,16 +1458,7 @@
                 <w:sz w:val="24"/>
                 <w:szCs w:val="24"/>
               </w:rPr>
-              <w:t>{</w:t>
-            </w:r>
-            <w:proofErr w:type="spellStart"/>
-            <w:r>
-              <w:rPr>
-                <w:rFonts w:asciiTheme="minorHAnsi" w:hAnsiTheme="minorHAnsi" w:cstheme="minorHAnsi"/>
-                <w:sz w:val="24"/>
-                <w:szCs w:val="24"/>
-              </w:rPr>
-              <w:t>do</w:t>
+              <w:t>{do</w:t>
             </w:r>
             <w:r>
               <w:rPr>
@@ -1545,7 +1468,6 @@
               </w:rPr>
               <w:t>d</w:t>
             </w:r>
-            <w:proofErr w:type="spellEnd"/>
             <w:r>
               <w:rPr>
                 <w:rFonts w:asciiTheme="minorHAnsi" w:hAnsiTheme="minorHAnsi" w:cstheme="minorHAnsi"/>
@@ -1720,39 +1642,7 @@
                 <w:rFonts w:ascii="Calibri" w:eastAsia="Calibri" w:hAnsi="Calibri"/>
                 <w:color w:val="000000"/>
               </w:rPr>
-              <w:t>Pre-Auth Details(</w:t>
-            </w:r>
-            <w:proofErr w:type="spellStart"/>
-            <w:r>
-              <w:rPr>
-                <w:rFonts w:ascii="Calibri" w:eastAsia="Calibri" w:hAnsi="Calibri"/>
-                <w:color w:val="000000"/>
-              </w:rPr>
-              <w:t>Amount,Estimates,Medical</w:t>
-            </w:r>
-            <w:proofErr w:type="spellEnd"/>
-            <w:r>
-              <w:rPr>
-                <w:rFonts w:ascii="Calibri" w:eastAsia="Calibri" w:hAnsi="Calibri"/>
-                <w:color w:val="000000"/>
-              </w:rPr>
-              <w:t xml:space="preserve"> History </w:t>
-            </w:r>
-            <w:proofErr w:type="spellStart"/>
-            <w:r>
-              <w:rPr>
-                <w:rFonts w:ascii="Calibri" w:eastAsia="Calibri" w:hAnsi="Calibri"/>
-                <w:color w:val="000000"/>
-              </w:rPr>
-              <w:t>etc</w:t>
-            </w:r>
-            <w:proofErr w:type="spellEnd"/>
-            <w:r>
-              <w:rPr>
-                <w:rFonts w:ascii="Calibri" w:eastAsia="Calibri" w:hAnsi="Calibri"/>
-                <w:color w:val="000000"/>
-              </w:rPr>
-              <w:t>)</w:t>
+              <w:t>Pre-Auth Details(Amount,Estimates,Medical History etc)</w:t>
             </w:r>
           </w:p>
         </w:tc>
@@ -1976,18 +1866,8 @@
                 <w:sz w:val="24"/>
                 <w:szCs w:val="24"/>
               </w:rPr>
-              <w:t>{</w:t>
-            </w:r>
-            <w:proofErr w:type="spellStart"/>
-            <w:r>
-              <w:rPr>
-                <w:rFonts w:asciiTheme="minorHAnsi" w:hAnsiTheme="minorHAnsi" w:cstheme="minorHAnsi"/>
-                <w:sz w:val="24"/>
-                <w:szCs w:val="24"/>
-              </w:rPr>
-              <w:t>hospitalname</w:t>
-            </w:r>
-            <w:proofErr w:type="spellEnd"/>
+              <w:t>{hospitalname</w:t>
+            </w:r>
             <w:r>
               <w:rPr>
                 <w:rFonts w:asciiTheme="minorHAnsi" w:hAnsiTheme="minorHAnsi" w:cstheme="minorHAnsi"/>
@@ -2002,25 +1882,7 @@
                 <w:sz w:val="24"/>
                 <w:szCs w:val="24"/>
               </w:rPr>
-              <w:t>{</w:t>
-            </w:r>
-            <w:proofErr w:type="spellStart"/>
-            <w:r>
-              <w:rPr>
-                <w:rFonts w:asciiTheme="minorHAnsi" w:hAnsiTheme="minorHAnsi" w:cstheme="minorHAnsi"/>
-                <w:sz w:val="24"/>
-                <w:szCs w:val="24"/>
-              </w:rPr>
-              <w:t>hospitallocation</w:t>
-            </w:r>
-            <w:proofErr w:type="spellEnd"/>
-            <w:r>
-              <w:rPr>
-                <w:rFonts w:asciiTheme="minorHAnsi" w:hAnsiTheme="minorHAnsi" w:cstheme="minorHAnsi"/>
-                <w:sz w:val="24"/>
-                <w:szCs w:val="24"/>
-              </w:rPr>
-              <w:t>}</w:t>
+              <w:t>{hospitallocation}</w:t>
             </w:r>
           </w:p>
         </w:tc>
@@ -3110,51 +2972,7 @@
           <w:sz w:val="24"/>
           <w:szCs w:val="24"/>
         </w:rPr>
-        <w:t>Claim verification by ASPIRA -</w:t>
-      </w:r>
-      <w:r>
-        <w:rPr>
-          <w:rFonts w:asciiTheme="minorHAnsi" w:hAnsiTheme="minorHAnsi" w:cstheme="minorHAnsi"/>
-          <w:sz w:val="24"/>
-          <w:szCs w:val="24"/>
-        </w:rPr>
-        <w:t>– We visited the {</w:t>
-      </w:r>
-      <w:proofErr w:type="spellStart"/>
-      <w:r>
-        <w:rPr>
-          <w:rFonts w:asciiTheme="minorHAnsi" w:hAnsiTheme="minorHAnsi" w:cstheme="minorHAnsi"/>
-          <w:sz w:val="24"/>
-          <w:szCs w:val="24"/>
-        </w:rPr>
-        <w:t>hospitalname</w:t>
-      </w:r>
-      <w:proofErr w:type="spellEnd"/>
-      <w:r>
-        <w:rPr>
-          <w:rFonts w:asciiTheme="minorHAnsi" w:hAnsiTheme="minorHAnsi" w:cstheme="minorHAnsi"/>
-          <w:sz w:val="24"/>
-          <w:szCs w:val="24"/>
-        </w:rPr>
-        <w:t>}, {</w:t>
-      </w:r>
-      <w:proofErr w:type="spellStart"/>
-      <w:r>
-        <w:rPr>
-          <w:rFonts w:asciiTheme="minorHAnsi" w:hAnsiTheme="minorHAnsi" w:cstheme="minorHAnsi"/>
-          <w:sz w:val="24"/>
-          <w:szCs w:val="24"/>
-        </w:rPr>
-        <w:t>hospitallocation</w:t>
-      </w:r>
-      <w:proofErr w:type="spellEnd"/>
-      <w:r>
-        <w:rPr>
-          <w:rFonts w:asciiTheme="minorHAnsi" w:hAnsiTheme="minorHAnsi" w:cstheme="minorHAnsi"/>
-          <w:sz w:val="24"/>
-          <w:szCs w:val="24"/>
-        </w:rPr>
-        <w:t>}</w:t>
+        <w:t>Claim verification by ASPIRA -– We visited the {hospitalname}, {hospitallocation}</w:t>
       </w:r>
       <w:r>
         <w:rPr>
@@ -3170,25 +2988,7 @@
           <w:sz w:val="24"/>
           <w:szCs w:val="24"/>
         </w:rPr>
-        <w:t>and enquired about the patient they confirmed the admission of the patient. Patient was admitted on {</w:t>
-      </w:r>
-      <w:proofErr w:type="spellStart"/>
-      <w:r>
-        <w:rPr>
-          <w:rFonts w:asciiTheme="minorHAnsi" w:hAnsiTheme="minorHAnsi" w:cstheme="minorHAnsi"/>
-          <w:sz w:val="24"/>
-          <w:szCs w:val="24"/>
-        </w:rPr>
-        <w:t>doa</w:t>
-      </w:r>
-      <w:proofErr w:type="spellEnd"/>
-      <w:r>
-        <w:rPr>
-          <w:rFonts w:asciiTheme="minorHAnsi" w:hAnsiTheme="minorHAnsi" w:cstheme="minorHAnsi"/>
-          <w:sz w:val="24"/>
-          <w:szCs w:val="24"/>
-        </w:rPr>
-        <w:t>}</w:t>
+        <w:t>and enquired about the patient they confirmed the admission of the patient. Patient was admitted on {doa}</w:t>
       </w:r>
       <w:r>
         <w:rPr>
@@ -3204,43 +3004,8 @@
           <w:sz w:val="24"/>
           <w:szCs w:val="24"/>
         </w:rPr>
-        <w:t>and discharged on {</w:t>
+        <w:t xml:space="preserve">and was diagnosed with </w:t>
       </w:r>
-      <w:proofErr w:type="spellStart"/>
-      <w:r>
-        <w:rPr>
-          <w:rFonts w:asciiTheme="minorHAnsi" w:hAnsiTheme="minorHAnsi" w:cstheme="minorHAnsi"/>
-          <w:sz w:val="24"/>
-          <w:szCs w:val="24"/>
-        </w:rPr>
-        <w:t>do</w:t>
-      </w:r>
-      <w:r>
-        <w:rPr>
-          <w:rFonts w:asciiTheme="minorHAnsi" w:hAnsiTheme="minorHAnsi" w:cstheme="minorHAnsi"/>
-          <w:sz w:val="24"/>
-          <w:szCs w:val="24"/>
-        </w:rPr>
-        <w:t>d</w:t>
-      </w:r>
-      <w:proofErr w:type="spellEnd"/>
-      <w:r>
-        <w:rPr>
-          <w:rFonts w:asciiTheme="minorHAnsi" w:hAnsiTheme="minorHAnsi" w:cstheme="minorHAnsi"/>
-          <w:sz w:val="24"/>
-          <w:szCs w:val="24"/>
-        </w:rPr>
-        <w:t xml:space="preserve">} was diagnosed </w:t>
-      </w:r>
-      <w:r>
-        <w:rPr>
-          <w:rFonts w:asciiTheme="minorHAnsi" w:hAnsiTheme="minorHAnsi" w:cstheme="minorHAnsi"/>
-          <w:sz w:val="24"/>
-          <w:szCs w:val="24"/>
-        </w:rPr>
-        <w:t xml:space="preserve">with </w:t>
-      </w:r>
-      <w:proofErr w:type="gramStart"/>
       <w:r>
         <w:rPr>
           <w:rFonts w:asciiTheme="minorHAnsi" w:hAnsiTheme="minorHAnsi" w:cstheme="minorHAnsi"/>
@@ -3267,7 +3032,6 @@
         </w:rPr>
         <w:t>(</w:t>
       </w:r>
-      <w:proofErr w:type="gramEnd"/>
       <w:r>
         <w:rPr>
           <w:rFonts w:asciiTheme="minorHAnsi" w:hAnsiTheme="minorHAnsi" w:cstheme="minorHAnsi"/>
@@ -3442,7 +3206,7 @@
                 <w:sz w:val="24"/>
                 <w:szCs w:val="24"/>
               </w:rPr>
-              <w:t>RC, Bill</w:t>
+              <w:t>Letter, Bill</w:t>
             </w:r>
           </w:p>
           <w:p/>
@@ -3702,25 +3466,7 @@
                 <w:sz w:val="24"/>
                 <w:szCs w:val="24"/>
               </w:rPr>
-              <w:t>{</w:t>
-            </w:r>
-            <w:proofErr w:type="spellStart"/>
-            <w:r>
-              <w:rPr>
-                <w:rFonts w:asciiTheme="minorHAnsi" w:hAnsiTheme="minorHAnsi" w:cstheme="minorHAnsi"/>
-                <w:sz w:val="24"/>
-                <w:szCs w:val="24"/>
-              </w:rPr>
-              <w:t>hospitallocation</w:t>
-            </w:r>
-            <w:proofErr w:type="spellEnd"/>
-            <w:r>
-              <w:rPr>
-                <w:rFonts w:asciiTheme="minorHAnsi" w:hAnsiTheme="minorHAnsi" w:cstheme="minorHAnsi"/>
-                <w:sz w:val="24"/>
-                <w:szCs w:val="24"/>
-              </w:rPr>
-              <w:t>}</w:t>
+              <w:t>{hospitallocation}</w:t>
             </w:r>
           </w:p>
         </w:tc>
@@ -4219,6 +3965,7 @@
   <w:style w:type="character" w:default="1" w:styleId="DefaultParagraphFont">
     <w:name w:val="Default Paragraph Font"/>
     <w:uiPriority w:val="1"/>
+    <w:semiHidden/>
     <w:unhideWhenUsed/>
   </w:style>
   <w:style w:type="table" w:default="1" w:styleId="TableNormal">

</xml_diff>